<commit_message>
ech-0294: mehrsprachige Inhalte (Block B) + TOC-Tiefe + Zebra-Tabellen
- description_fr fuer alle Elemente ergaenzt (schema.yaml 214/214,
  schema_common.yaml 41/41); DE war bereits vollstaendig.
- EN- und FR-Uebersetzung aller Prosa-Kapitel (input/en, input/fr).
- localize_schema.py lokalisiert jetzt auch importierte Schemas
  (schema_common), damit geerbte Slots (global_uri, valid_from, ...) in der
  Zielsprache erscheinen; Label "Inheritance" uebersetzt.
- Inhaltsverzeichnis nur bis Ebene 2 (TOC \o "1-2"): Unterpunkte wie
  4.1.1 Attribute/Usages/Examples erscheinen nicht mehr.
- template.docx: Tabellen mit alternierender Zeilenschattierung (band1Horz,
  hellgrau F2F2F2).

Lokal fuer de/fr/en end-to-end gebaut und geprueft.

Co-Authored-By: Claude Opus 4.8 (1M context) <noreply@anthropic.com>
</commit_message>
<xml_diff>
--- a/ech-0294_actors/input/template.docx
+++ b/ech-0294_actors/input/template.docx
@@ -2450,6 +2450,11 @@
           <w:bottom w:val="single" w:sz="0" w:space="0" w:color="auto"/>
         </w:tcBorders>
         <w:vAlign w:val="bottom"/>
+      </w:tcPr>
+    </w:tblStylePr>
+    <w:tblStylePr w:type="band1Horz">
+      <w:tcPr>
+        <w:shd w:val="clear" w:color="auto" w:fill="F2F2F2"/>
       </w:tcPr>
     </w:tblStylePr>
   </w:style>

</xml_diff>

<commit_message>
ech-0294: Zebra-Streifen zuverlaessig einbacken (statt Tabellenstil)
Word rendert style-basiertes Zeilen-Banding nicht zuverlaessig. Neuer
Post-Processing-Schritt shade_alternate_rows.py backt eine hellgraue
Schattierung (F2F2F2) explizit in jede zweite Tabellen-Body-Zeile ein ->
rendert identisch in Word, LibreOffice und PDF. Style-basiertes Banding
(band1Horz/tblStyleRowBandSize) wieder aus template.docx entfernt.
Per LibreOffice-PDF visuell verifiziert.

Co-Authored-By: Claude Opus 4.8 (1M context) <noreply@anthropic.com>
</commit_message>
<xml_diff>
--- a/ech-0294_actors/input/template.docx
+++ b/ech-0294_actors/input/template.docx
@@ -2430,7 +2430,6 @@
     <w:unhideWhenUsed/>
     <w:qFormat/>
     <w:tblPr>
-      <w:tblStyleRowBandSize w:val="1"/>
       <w:tblInd w:w="0" w:type="dxa"/>
       <w:tblCellMar>
         <w:top w:w="0" w:type="dxa"/>
@@ -2451,11 +2450,6 @@
           <w:bottom w:val="single" w:sz="0" w:space="0" w:color="auto"/>
         </w:tcBorders>
         <w:vAlign w:val="bottom"/>
-      </w:tcPr>
-    </w:tblStylePr>
-    <w:tblStylePr w:type="band1Horz">
-      <w:tcPr>
-        <w:shd w:val="clear" w:color="auto" w:fill="F2F2F2"/>
       </w:tcPr>
     </w:tblStylePr>
   </w:style>

</xml_diff>

<commit_message>
ech-0294: Fusszeile aktualisieren (Platzhalter -> eCH-0294 / 0.2 / Entwurf)
Statt "xxxx / 0.0.1 / Draft / 2025-05-20" nun
"eCH-0294 – Political Affairs / Actors / 0.2 / Entwurf / 2026-07-17" —
in template.docx (Word, alle 3 Sprachen) und im PDF-footer-info (alle 3 PDFs).

Co-Authored-By: Claude Opus 4.8 (1M context) <noreply@anthropic.com>
</commit_message>
<xml_diff>
--- a/ech-0294_actors/input/template.docx
+++ b/ech-0294_actors/input/template.docx
@@ -605,7 +605,7 @@
         <w:szCs w:val="20"/>
         <w:lang w:val="en-GB"/>
       </w:rPr>
-      <w:t>xxxx</w:t>
+      <w:t>eCH-0294</w:t>
     </w:r>
     <w:proofErr w:type="spellEnd"/>
     <w:r>
@@ -642,7 +642,7 @@
         <w:szCs w:val="20"/>
         <w:lang w:val="en-GB"/>
       </w:rPr>
-      <w:t xml:space="preserve"> / 0.0.1 / Draft / 202</w:t>
+      <w:t xml:space="preserve"> / 0.2 / Entwurf / 2026-07-17</w:t>
     </w:r>
     <w:r>
       <w:rPr>
@@ -651,7 +651,7 @@
         <w:szCs w:val="20"/>
         <w:lang w:val="en-GB"/>
       </w:rPr>
-      <w:t>5</w:t>
+      <w:t/>
     </w:r>
     <w:r>
       <w:rPr>
@@ -660,7 +660,7 @@
         <w:szCs w:val="20"/>
         <w:lang w:val="en-GB"/>
       </w:rPr>
-      <w:t>-0</w:t>
+      <w:t/>
     </w:r>
     <w:r>
       <w:rPr>
@@ -669,7 +669,7 @@
         <w:szCs w:val="20"/>
         <w:lang w:val="en-GB"/>
       </w:rPr>
-      <w:t>5</w:t>
+      <w:t/>
     </w:r>
     <w:r>
       <w:rPr>
@@ -678,7 +678,7 @@
         <w:szCs w:val="20"/>
         <w:lang w:val="en-GB"/>
       </w:rPr>
-      <w:t>-2</w:t>
+      <w:t/>
     </w:r>
     <w:r>
       <w:rPr>
@@ -687,7 +687,7 @@
         <w:szCs w:val="20"/>
         <w:lang w:val="en-GB"/>
       </w:rPr>
-      <w:t>0</w:t>
+      <w:t/>
     </w:r>
   </w:p>
 </w:ftr>

</xml_diff>

<commit_message>
ech-0294: Beispieltitel robust lokalisieren, Seitenzahl in Fusszeilengroesse
- merge_documentation.py bildet die Beispiel-Ueberschrift ueber denselben
  Slug wie extract_examples.py ab. Vorher wurde der Rohtitel verglichen, was
  bei Klammern oder Laengenbegrenzung nicht traf ("(zweite Person)").
- slugify() von 60 auf 80 Zeichen, damit laengere Titel nicht abschneiden.
- Englische Beispieltitel und Prosa auf die umbenannten Enum-Werte
  angeglichen (committee statt commission, parliamentary group statt faction).
- template.docx: Zeichenformat "Seitenzahl" auf 10 pt, damit die Paginierung
  oben rechts gleich gross ist wie der Text in der Fusszeile.

Co-Authored-By: Claude Opus 5 (1M context) <noreply@anthropic.com>
</commit_message>
<xml_diff>
--- a/ech-0294_actors/input/template.docx
+++ b/ech-0294_actors/input/template.docx
@@ -2591,6 +2591,10 @@
     <w:name w:val="page number"/>
     <w:basedOn w:val="Absatz-Standardschriftart"/>
     <w:rsid w:val="009B0C77"/>
+    <w:rPr>
+      <w:sz w:val="20"/>
+      <w:szCs w:val="20"/>
+    </w:rPr>
   </w:style>
   <w:style w:type="character" w:styleId="BesuchterLink">
     <w:name w:val="FollowedHyperlink"/>

</xml_diff>

<commit_message>
ech-0294: Inline-Code im Fliesstext von 8pt auf 11pt
Begriffe wie InterestLink oder valid_from standen im Fliesstext auf 8pt
Consolas, waehrend der Body 12pt Arial fuehrt -- ein Drittel kleiner, was den
Lesefluss bricht. Ursache war die Vererbung: VerbatimChar hing an
BeschriftungZchn, dem Zeichenstil der Bildlegenden.

VerbatimChar allein anzuheben haette auch die Beispielbloecke vergroessert,
weil pandoc alle Syntax-Token-Stile darauf abstuetzt (FunctionTok, KeywordTok
usw. sind basedOn VerbatimChar). Die Bloecke laufen mit wordWrap off und
Zeilen bis 80 Zeichen; auf 11pt waeren sie ueber den Satzspiegel gelaufen.
Die Vorlage fuehrt die 31 Token-Stile deshalb neu selbst, mit sz 16 fest
verdrahtet -- pandoc uebernimmt vorhandene Stile aus der Referenzvorlage und
legt nur fehlende an.

Geprueft am gebauten Dokument: 120 Inline-Vorkommen auf sz 22, 1847
Block-Runs unveraendert auf sz 16.
</commit_message>
<xml_diff>
--- a/ech-0294_actors/input/template.docx
+++ b/ech-0294_actors/input/template.docx
@@ -2513,7 +2513,8 @@
     <w:basedOn w:val="BeschriftungZchn"/>
     <w:rPr>
       <w:rFonts w:ascii="Consolas" w:hAnsi="Consolas"/>
-      <w:sz w:val="16"/>
+      <w:sz w:val="22"/>
+      <w:szCs w:val="22"/>
     </w:rPr>
   </w:style>
   <w:style w:type="character" w:customStyle="1" w:styleId="SectionNumber">
@@ -2655,6 +2656,305 @@
       <w:numPr>
         <w:numId w:val="6"/>
       </w:numPr>
+    </w:pPr>
+  </w:style>
+  <w:style w:type="character" w:customStyle="1" w:styleId="KeywordTok">
+    <w:name w:val="KeywordTok"/>
+    <w:basedOn w:val="VerbatimChar"/>
+    <w:rPr>
+      <w:sz w:val="16"/>
+      <w:szCs w:val="16"/>
+      <w:b/>
+      <w:color w:val="007020"/>
+    </w:rPr>
+  </w:style>
+  <w:style w:type="character" w:customStyle="1" w:styleId="DataTypeTok">
+    <w:name w:val="DataTypeTok"/>
+    <w:basedOn w:val="VerbatimChar"/>
+    <w:rPr>
+      <w:sz w:val="16"/>
+      <w:szCs w:val="16"/>
+      <w:color w:val="902000"/>
+    </w:rPr>
+  </w:style>
+  <w:style w:type="character" w:customStyle="1" w:styleId="DecValTok">
+    <w:name w:val="DecValTok"/>
+    <w:basedOn w:val="VerbatimChar"/>
+    <w:rPr>
+      <w:sz w:val="16"/>
+      <w:szCs w:val="16"/>
+      <w:color w:val="40a070"/>
+    </w:rPr>
+  </w:style>
+  <w:style w:type="character" w:customStyle="1" w:styleId="BaseNTok">
+    <w:name w:val="BaseNTok"/>
+    <w:basedOn w:val="VerbatimChar"/>
+    <w:rPr>
+      <w:sz w:val="16"/>
+      <w:szCs w:val="16"/>
+      <w:color w:val="40a070"/>
+    </w:rPr>
+  </w:style>
+  <w:style w:type="character" w:customStyle="1" w:styleId="FloatTok">
+    <w:name w:val="FloatTok"/>
+    <w:basedOn w:val="VerbatimChar"/>
+    <w:rPr>
+      <w:sz w:val="16"/>
+      <w:szCs w:val="16"/>
+      <w:color w:val="40a070"/>
+    </w:rPr>
+  </w:style>
+  <w:style w:type="character" w:customStyle="1" w:styleId="ConstantTok">
+    <w:name w:val="ConstantTok"/>
+    <w:basedOn w:val="VerbatimChar"/>
+    <w:rPr>
+      <w:sz w:val="16"/>
+      <w:szCs w:val="16"/>
+      <w:color w:val="880000"/>
+    </w:rPr>
+  </w:style>
+  <w:style w:type="character" w:customStyle="1" w:styleId="CharTok">
+    <w:name w:val="CharTok"/>
+    <w:basedOn w:val="VerbatimChar"/>
+    <w:rPr>
+      <w:sz w:val="16"/>
+      <w:szCs w:val="16"/>
+      <w:color w:val="4070a0"/>
+    </w:rPr>
+  </w:style>
+  <w:style w:type="character" w:customStyle="1" w:styleId="SpecialCharTok">
+    <w:name w:val="SpecialCharTok"/>
+    <w:basedOn w:val="VerbatimChar"/>
+    <w:rPr>
+      <w:sz w:val="16"/>
+      <w:szCs w:val="16"/>
+      <w:color w:val="4070a0"/>
+    </w:rPr>
+  </w:style>
+  <w:style w:type="character" w:customStyle="1" w:styleId="StringTok">
+    <w:name w:val="StringTok"/>
+    <w:basedOn w:val="VerbatimChar"/>
+    <w:rPr>
+      <w:sz w:val="16"/>
+      <w:szCs w:val="16"/>
+      <w:color w:val="4070a0"/>
+    </w:rPr>
+  </w:style>
+  <w:style w:type="character" w:customStyle="1" w:styleId="VerbatimStringTok">
+    <w:name w:val="VerbatimStringTok"/>
+    <w:basedOn w:val="VerbatimChar"/>
+    <w:rPr>
+      <w:sz w:val="16"/>
+      <w:szCs w:val="16"/>
+      <w:color w:val="4070a0"/>
+    </w:rPr>
+  </w:style>
+  <w:style w:type="character" w:customStyle="1" w:styleId="SpecialStringTok">
+    <w:name w:val="SpecialStringTok"/>
+    <w:basedOn w:val="VerbatimChar"/>
+    <w:rPr>
+      <w:sz w:val="16"/>
+      <w:szCs w:val="16"/>
+      <w:color w:val="bb6688"/>
+    </w:rPr>
+  </w:style>
+  <w:style w:type="character" w:customStyle="1" w:styleId="ImportTok">
+    <w:name w:val="ImportTok"/>
+    <w:basedOn w:val="VerbatimChar"/>
+    <w:rPr>
+      <w:sz w:val="16"/>
+      <w:szCs w:val="16"/>
+      <w:b/>
+      <w:color w:val="008000"/>
+    </w:rPr>
+  </w:style>
+  <w:style w:type="character" w:customStyle="1" w:styleId="CommentTok">
+    <w:name w:val="CommentTok"/>
+    <w:basedOn w:val="VerbatimChar"/>
+    <w:rPr>
+      <w:sz w:val="16"/>
+      <w:szCs w:val="16"/>
+      <w:i/>
+      <w:color w:val="60a0b0"/>
+    </w:rPr>
+  </w:style>
+  <w:style w:type="character" w:customStyle="1" w:styleId="DocumentationTok">
+    <w:name w:val="DocumentationTok"/>
+    <w:basedOn w:val="VerbatimChar"/>
+    <w:rPr>
+      <w:sz w:val="16"/>
+      <w:szCs w:val="16"/>
+      <w:i/>
+      <w:color w:val="ba2121"/>
+    </w:rPr>
+  </w:style>
+  <w:style w:type="character" w:customStyle="1" w:styleId="AnnotationTok">
+    <w:name w:val="AnnotationTok"/>
+    <w:basedOn w:val="VerbatimChar"/>
+    <w:rPr>
+      <w:sz w:val="16"/>
+      <w:szCs w:val="16"/>
+      <w:b/>
+      <w:i/>
+      <w:color w:val="60a0b0"/>
+    </w:rPr>
+  </w:style>
+  <w:style w:type="character" w:customStyle="1" w:styleId="CommentVarTok">
+    <w:name w:val="CommentVarTok"/>
+    <w:basedOn w:val="VerbatimChar"/>
+    <w:rPr>
+      <w:sz w:val="16"/>
+      <w:szCs w:val="16"/>
+      <w:b/>
+      <w:i/>
+      <w:color w:val="60a0b0"/>
+    </w:rPr>
+  </w:style>
+  <w:style w:type="character" w:customStyle="1" w:styleId="OtherTok">
+    <w:name w:val="OtherTok"/>
+    <w:basedOn w:val="VerbatimChar"/>
+    <w:rPr>
+      <w:sz w:val="16"/>
+      <w:szCs w:val="16"/>
+      <w:color w:val="007020"/>
+    </w:rPr>
+  </w:style>
+  <w:style w:type="character" w:customStyle="1" w:styleId="FunctionTok">
+    <w:name w:val="FunctionTok"/>
+    <w:basedOn w:val="VerbatimChar"/>
+    <w:rPr>
+      <w:sz w:val="16"/>
+      <w:szCs w:val="16"/>
+      <w:color w:val="06287e"/>
+    </w:rPr>
+  </w:style>
+  <w:style w:type="character" w:customStyle="1" w:styleId="VariableTok">
+    <w:name w:val="VariableTok"/>
+    <w:basedOn w:val="VerbatimChar"/>
+    <w:rPr>
+      <w:sz w:val="16"/>
+      <w:szCs w:val="16"/>
+      <w:color w:val="19177c"/>
+    </w:rPr>
+  </w:style>
+  <w:style w:type="character" w:customStyle="1" w:styleId="ControlFlowTok">
+    <w:name w:val="ControlFlowTok"/>
+    <w:basedOn w:val="VerbatimChar"/>
+    <w:rPr>
+      <w:sz w:val="16"/>
+      <w:szCs w:val="16"/>
+      <w:b/>
+      <w:color w:val="007020"/>
+    </w:rPr>
+  </w:style>
+  <w:style w:type="character" w:customStyle="1" w:styleId="OperatorTok">
+    <w:name w:val="OperatorTok"/>
+    <w:basedOn w:val="VerbatimChar"/>
+    <w:rPr>
+      <w:sz w:val="16"/>
+      <w:szCs w:val="16"/>
+      <w:color w:val="666666"/>
+    </w:rPr>
+  </w:style>
+  <w:style w:type="character" w:customStyle="1" w:styleId="BuiltInTok">
+    <w:name w:val="BuiltInTok"/>
+    <w:basedOn w:val="VerbatimChar"/>
+    <w:rPr>
+      <w:sz w:val="16"/>
+      <w:szCs w:val="16"/>
+      <w:color w:val="008000"/>
+    </w:rPr>
+  </w:style>
+  <w:style w:type="character" w:customStyle="1" w:styleId="ExtensionTok">
+    <w:name w:val="ExtensionTok"/>
+    <w:basedOn w:val="VerbatimChar"/>
+    <w:rPr>
+      <w:sz w:val="16"/>
+      <w:szCs w:val="16"/>
+    </w:rPr>
+  </w:style>
+  <w:style w:type="character" w:customStyle="1" w:styleId="PreprocessorTok">
+    <w:name w:val="PreprocessorTok"/>
+    <w:basedOn w:val="VerbatimChar"/>
+    <w:rPr>
+      <w:sz w:val="16"/>
+      <w:szCs w:val="16"/>
+      <w:color w:val="bc7a00"/>
+    </w:rPr>
+  </w:style>
+  <w:style w:type="character" w:customStyle="1" w:styleId="AttributeTok">
+    <w:name w:val="AttributeTok"/>
+    <w:basedOn w:val="VerbatimChar"/>
+    <w:rPr>
+      <w:sz w:val="16"/>
+      <w:szCs w:val="16"/>
+      <w:color w:val="7d9029"/>
+    </w:rPr>
+  </w:style>
+  <w:style w:type="character" w:customStyle="1" w:styleId="RegionMarkerTok">
+    <w:name w:val="RegionMarkerTok"/>
+    <w:basedOn w:val="VerbatimChar"/>
+    <w:rPr>
+      <w:sz w:val="16"/>
+      <w:szCs w:val="16"/>
+    </w:rPr>
+  </w:style>
+  <w:style w:type="character" w:customStyle="1" w:styleId="InformationTok">
+    <w:name w:val="InformationTok"/>
+    <w:basedOn w:val="VerbatimChar"/>
+    <w:rPr>
+      <w:sz w:val="16"/>
+      <w:szCs w:val="16"/>
+      <w:b/>
+      <w:i/>
+      <w:color w:val="60a0b0"/>
+    </w:rPr>
+  </w:style>
+  <w:style w:type="character" w:customStyle="1" w:styleId="WarningTok">
+    <w:name w:val="WarningTok"/>
+    <w:basedOn w:val="VerbatimChar"/>
+    <w:rPr>
+      <w:sz w:val="16"/>
+      <w:szCs w:val="16"/>
+      <w:b/>
+      <w:i/>
+      <w:color w:val="60a0b0"/>
+    </w:rPr>
+  </w:style>
+  <w:style w:type="character" w:customStyle="1" w:styleId="AlertTok">
+    <w:name w:val="AlertTok"/>
+    <w:basedOn w:val="VerbatimChar"/>
+    <w:rPr>
+      <w:sz w:val="16"/>
+      <w:szCs w:val="16"/>
+      <w:b/>
+      <w:color w:val="ff0000"/>
+    </w:rPr>
+  </w:style>
+  <w:style w:type="character" w:customStyle="1" w:styleId="ErrorTok">
+    <w:name w:val="ErrorTok"/>
+    <w:basedOn w:val="VerbatimChar"/>
+    <w:rPr>
+      <w:sz w:val="16"/>
+      <w:szCs w:val="16"/>
+      <w:b/>
+      <w:color w:val="ff0000"/>
+    </w:rPr>
+  </w:style>
+  <w:style w:type="character" w:customStyle="1" w:styleId="NormalTok">
+    <w:name w:val="NormalTok"/>
+    <w:basedOn w:val="VerbatimChar"/>
+    <w:rPr>
+      <w:sz w:val="16"/>
+      <w:szCs w:val="16"/>
+    </w:rPr>
+  </w:style>
+  <w:style w:type="paragraph" w:customStyle="1" w:styleId="SourceCode">
+    <w:name w:val="Source Code"/>
+    <w:basedOn w:val="Normal"/>
+    <w:link w:val="VerbatimChar"/>
+    <w:pPr>
+      <w:wordWrap w:val="off"/>
     </w:pPr>
   </w:style>
 </w:styles>

</xml_diff>